<commit_message>
Add Easter Sunrise support, fix reading sheet psalms, and fix 7pm song lookup
- Add sunrise service type with own propers/music, disambiguated from
  Easter Day via service_type_filter on Google Sheet lookup
- Fix reading sheet psalm formatting: unison psalms now bold, LORD
  renders as small-caps Lord via _add_text_runs, \v continuation
  lines handled properly
- Enable reading sheet generation for weekday services (Maundy Thursday,
  Good Friday)
- Fix 7pm song lookup: normalize service to "11am" pool, add
  punctuation-stripped fuzzy matching
- Fix hymnal songs printing lyrics in 7pm (uses_hymnals includes "7 pm")
- Update Good Friday inside back cover template

Co-Authored-By: Claude Opus 4.6 <noreply@anthropic.com>
</commit_message>
<xml_diff>
--- a/templates/inside_back_cover_good_friday.docx
+++ b/templates/inside_back_cover_good_friday.docx
@@ -3,9 +3,6 @@
 <w:document xmlns:wpc="http://schemas.microsoft.com/office/word/2010/wordprocessingCanvas" xmlns:cx="http://schemas.microsoft.com/office/drawing/2014/chartex" xmlns:cx1="http://schemas.microsoft.com/office/drawing/2015/9/8/chartex" xmlns:cx2="http://schemas.microsoft.com/office/drawing/2015/10/21/chartex" xmlns:cx3="http://schemas.microsoft.com/office/drawing/2016/5/9/chartex" xmlns:cx4="http://schemas.microsoft.com/office/drawing/2016/5/10/chartex" xmlns:cx5="http://schemas.microsoft.com/office/drawing/2016/5/11/chartex" xmlns:cx6="http://schemas.microsoft.com/office/drawing/2016/5/12/chartex" xmlns:cx7="http://schemas.microsoft.com/office/drawing/2016/5/13/chartex" xmlns:cx8="http://schemas.microsoft.com/office/drawing/2016/5/14/chartex" xmlns:mc="http://schemas.openxmlformats.org/markup-compatibility/2006" xmlns:aink="http://schemas.microsoft.com/office/drawing/2016/ink" xmlns:am3d="http://schemas.microsoft.com/office/drawing/2017/model3d" xmlns:o="urn:schemas-microsoft-com:office:office" xmlns:oel="http://schemas.microsoft.com/office/2019/extlst" xmlns:r="http://schemas.openxmlformats.org/officeDocument/2006/relationships" xmlns:m="http://schemas.openxmlformats.org/officeDocument/2006/math" xmlns:v="urn:schemas-microsoft-com:vml" xmlns:wp14="http://schemas.microsoft.com/office/word/2010/wordprocessingDrawing" xmlns:wp="http://schemas.openxmlformats.org/drawingml/2006/wordprocessingDrawing" xmlns:w10="urn:schemas-microsoft-com:office:word" xmlns:w="http://schemas.openxmlformats.org/wordprocessingml/2006/main" xmlns:w14="http://schemas.microsoft.com/office/word/2010/wordml" xmlns:w15="http://schemas.microsoft.com/office/word/2012/wordml" xmlns:w16cex="http://schemas.microsoft.com/office/word/2018/wordml/cex" xmlns:w16cid="http://schemas.microsoft.com/office/word/2016/wordml/cid" xmlns:w16="http://schemas.microsoft.com/office/word/2018/wordml" xmlns:w16du="http://schemas.microsoft.com/office/word/2023/wordml/word16du" xmlns:w16sdtdh="http://schemas.microsoft.com/office/word/2020/wordml/sdtdatahash" xmlns:w16sdtfl="http://schemas.microsoft.com/office/word/2024/wordml/sdtformatlock" xmlns:w16se="http://schemas.microsoft.com/office/word/2015/wordml/symex" xmlns:wpg="http://schemas.microsoft.com/office/word/2010/wordprocessingGroup" xmlns:wpi="http://schemas.microsoft.com/office/word/2010/wordprocessingInk" xmlns:wne="http://schemas.microsoft.com/office/word/2006/wordml" xmlns:wps="http://schemas.microsoft.com/office/word/2010/wordprocessingShape" mc:Ignorable="w14 w15 w16se w16cid w16 w16cex w16sdtdh w16sdtfl w16du wp14">
   <w:body>
     <w:p>
-      <w:pPr>
-        <w:pStyle w:val="Heading"/>
-      </w:pPr>
       <w:r>
         <w:rPr>
           <w:noProof/>
@@ -13,18 +10,10 @@
         <mc:AlternateContent>
           <mc:Choice Requires="wpg">
             <w:drawing>
-              <wp:anchor distT="0" distB="0" distL="114300" distR="114300" simplePos="0" relativeHeight="251659264" behindDoc="0" locked="0" layoutInCell="1" allowOverlap="1" wp14:anchorId="5822458E" wp14:editId="4B32C256">
-                <wp:simplePos x="0" y="0"/>
-                <wp:positionH relativeFrom="column">
-                  <wp:posOffset>0</wp:posOffset>
-                </wp:positionH>
-                <wp:positionV relativeFrom="paragraph">
-                  <wp:posOffset>21273</wp:posOffset>
-                </wp:positionV>
+              <wp:inline distT="0" distB="0" distL="0" distR="0" wp14:anchorId="180A6110" wp14:editId="0FB09B15">
                 <wp:extent cx="5486400" cy="2963545"/>
                 <wp:effectExtent l="0" t="0" r="0" b="0"/>
-                <wp:wrapNone/>
-                <wp:docPr id="1850932852" name="Group 9"/>
+                <wp:docPr id="715119006" name="Group 4"/>
                 <wp:cNvGraphicFramePr/>
                 <a:graphic xmlns:a="http://schemas.openxmlformats.org/drawingml/2006/main">
                   <a:graphicData uri="http://schemas.microsoft.com/office/word/2010/wordprocessingGroup">
@@ -40,7 +29,7 @@
                       </wpg:grpSpPr>
                       <pic:pic xmlns:pic="http://schemas.openxmlformats.org/drawingml/2006/picture">
                         <pic:nvPicPr>
-                          <pic:cNvPr id="235104884" name="Picture 1"/>
+                          <pic:cNvPr id="360865118" name="Picture 1"/>
                           <pic:cNvPicPr>
                             <a:picLocks noChangeAspect="1"/>
                           </pic:cNvPicPr>
@@ -71,11 +60,11 @@
                         </pic:spPr>
                       </pic:pic>
                       <wps:wsp>
-                        <wps:cNvPr id="1155838919" name="Text Box 4"/>
+                        <wps:cNvPr id="2116291093" name="Text Box 4"/>
                         <wps:cNvSpPr txBox="1"/>
                         <wps:spPr>
                           <a:xfrm>
-                            <a:off x="221456" y="78581"/>
+                            <a:off x="218209" y="72736"/>
                             <a:ext cx="3671570" cy="2884964"/>
                           </a:xfrm>
                           <a:prstGeom prst="rect">
@@ -108,23 +97,9 @@
                             </w:p>
                             <w:p>
                               <w:pPr>
-                                <w:tabs>
-                                  <w:tab w:val="left" w:pos="2080"/>
-                                </w:tabs>
-                                <w:autoSpaceDE w:val="0"/>
-                                <w:autoSpaceDN w:val="0"/>
-                                <w:adjustRightInd w:val="0"/>
-                                <w:spacing w:after="60" w:line="240" w:lineRule="auto"/>
-                                <w:rPr>
-                                  <w:rFonts w:ascii="Gill Sans Nova Medium" w:hAnsi="Gill Sans Nova Medium" w:cs="Gill Sans"/>
-                                  <w:color w:val="000000"/>
-                                </w:rPr>
+                                <w:pStyle w:val="InsideCoverHeadingBlack"/>
                               </w:pPr>
                               <w:r>
-                                <w:rPr>
-                                  <w:rFonts w:ascii="Gill Sans Nova Medium" w:hAnsi="Gill Sans Nova Medium" w:cs="Gill Sans"/>
-                                  <w:color w:val="000000"/>
-                                </w:rPr>
                                 <w:t xml:space="preserve">Easter Sunrise - 6:30 am at the Garden Chapel </w:t>
                               </w:r>
                             </w:p>
@@ -156,61 +131,7 @@
                                   <w:sz w:val="20"/>
                                   <w:szCs w:val="20"/>
                                 </w:rPr>
-                                <w:t xml:space="preserve">With </w:t>
-                              </w:r>
-                              <w:r>
-                                <w:rPr>
-                                  <w:rFonts w:ascii="Gill Sans Nova Light" w:hAnsi="Gill Sans Nova Light" w:cs="Gill Sans Nova Light"/>
-                                  <w:color w:val="000000"/>
-                                  <w:sz w:val="20"/>
-                                  <w:szCs w:val="20"/>
-                                </w:rPr>
-                                <w:t xml:space="preserve">elements of the Easter vigil, including the new fire, </w:t>
-                              </w:r>
-                              <w:r>
-                                <w:rPr>
-                                  <w:rFonts w:ascii="Gill Sans Nova Light" w:hAnsi="Gill Sans Nova Light" w:cs="Gill Sans Nova Light"/>
-                                  <w:color w:val="000000"/>
-                                  <w:sz w:val="20"/>
-                                  <w:szCs w:val="20"/>
-                                </w:rPr>
-                                <w:t>a</w:t>
-                              </w:r>
-                              <w:r>
-                                <w:rPr>
-                                  <w:rFonts w:ascii="Gill Sans Nova Light" w:hAnsi="Gill Sans Nova Light" w:cs="Gill Sans Nova Light"/>
-                                  <w:color w:val="000000"/>
-                                  <w:sz w:val="20"/>
-                                  <w:szCs w:val="20"/>
-                                </w:rPr>
-                                <w:t xml:space="preserve">ccompanied by acoustic </w:t>
-                              </w:r>
-                              <w:r>
-                                <w:rPr>
-                                  <w:rFonts w:ascii="Gill Sans Nova Light" w:hAnsi="Gill Sans Nova Light" w:cs="Gill Sans Nova Light"/>
-                                  <w:color w:val="000000"/>
-                                  <w:sz w:val="20"/>
-                                  <w:szCs w:val="20"/>
-                                </w:rPr>
-                                <w:t xml:space="preserve">music, this beautiful </w:t>
-                              </w:r>
-                              <w:r>
-                                <w:rPr>
-                                  <w:rFonts w:ascii="Gill Sans Nova Light" w:hAnsi="Gill Sans Nova Light" w:cs="Gill Sans Nova Light"/>
-                                  <w:color w:val="000000"/>
-                                  <w:sz w:val="20"/>
-                                  <w:szCs w:val="20"/>
-                                </w:rPr>
-                                <w:t>liturgy</w:t>
-                              </w:r>
-                              <w:r>
-                                <w:rPr>
-                                  <w:rFonts w:ascii="Gill Sans Nova Light" w:hAnsi="Gill Sans Nova Light" w:cs="Gill Sans Nova Light"/>
-                                  <w:color w:val="000000"/>
-                                  <w:sz w:val="20"/>
-                                  <w:szCs w:val="20"/>
-                                </w:rPr>
-                                <w:t xml:space="preserve"> will begin while it is mostly dark and end in the full brightness of Easter morning. The Easter Sunrise service takes place at the outdoor Garden Chapel (on the front lawn). </w:t>
+                                <w:t xml:space="preserve">With elements of the Easter vigil, including the new fire, accompanied by acoustic music, this beautiful liturgy will begin while it is mostly dark and end in the full brightness of Easter morning. The Easter Sunrise service takes place at the outdoor Garden Chapel (on the front lawn). </w:t>
                               </w:r>
                               <w:r>
                                 <w:rPr>
@@ -248,23 +169,9 @@
                             </w:p>
                             <w:p>
                               <w:pPr>
-                                <w:tabs>
-                                  <w:tab w:val="left" w:pos="2080"/>
-                                </w:tabs>
-                                <w:autoSpaceDE w:val="0"/>
-                                <w:autoSpaceDN w:val="0"/>
-                                <w:adjustRightInd w:val="0"/>
-                                <w:spacing w:after="60" w:line="240" w:lineRule="auto"/>
-                                <w:rPr>
-                                  <w:rFonts w:ascii="Gill Sans Nova Medium" w:hAnsi="Gill Sans Nova Medium" w:cs="Gill Sans"/>
-                                  <w:color w:val="000000"/>
-                                </w:rPr>
+                                <w:pStyle w:val="InsideCoverHeadingBlack"/>
                               </w:pPr>
                               <w:r>
-                                <w:rPr>
-                                  <w:rFonts w:ascii="Gill Sans Nova Medium" w:hAnsi="Gill Sans Nova Medium" w:cs="Gill Sans"/>
-                                  <w:color w:val="000000"/>
-                                </w:rPr>
                                 <w:t>The Great Easter Egg Hunt - 10 am (between services)</w:t>
                               </w:r>
                             </w:p>
@@ -299,24 +206,16 @@
                             </w:p>
                             <w:p>
                               <w:pPr>
-                                <w:tabs>
-                                  <w:tab w:val="left" w:pos="2080"/>
-                                </w:tabs>
-                                <w:autoSpaceDE w:val="0"/>
-                                <w:autoSpaceDN w:val="0"/>
-                                <w:adjustRightInd w:val="0"/>
-                                <w:spacing w:after="60" w:line="240" w:lineRule="auto"/>
-                                <w:rPr>
-                                  <w:rFonts w:ascii="Gill Sans Nova Medium" w:hAnsi="Gill Sans Nova Medium" w:cs="Gill Sans"/>
-                                  <w:color w:val="000000"/>
-                                </w:rPr>
+                                <w:pStyle w:val="InsideCoverHeadingBlack"/>
                               </w:pPr>
                               <w:r>
-                                <w:rPr>
-                                  <w:rFonts w:ascii="Gill Sans Nova Medium" w:hAnsi="Gill Sans Nova Medium" w:cs="Gill Sans"/>
-                                  <w:color w:val="000000"/>
-                                </w:rPr>
-                                <w:t>Easter Day Services - 8 am, 9 am and 11 am</w:t>
+                                <w:t xml:space="preserve">Easter Day Services - 8 am, 9 am </w:t>
+                              </w:r>
+                              <w:r>
+                                <w:t>and</w:t>
+                              </w:r>
+                              <w:r>
+                                <w:t xml:space="preserve"> 11 am</w:t>
                               </w:r>
                             </w:p>
                             <w:p>
@@ -347,12 +246,12 @@
                     </wpg:wgp>
                   </a:graphicData>
                 </a:graphic>
-              </wp:anchor>
+              </wp:inline>
             </w:drawing>
           </mc:Choice>
           <mc:Fallback>
             <w:pict>
-              <v:group w14:anchorId="5822458E" id="Group 9" o:spid="_x0000_s1026" style="position:absolute;left:0;text-align:left;margin-left:0;margin-top:1.7pt;width:6in;height:233.35pt;z-index:251659264" coordsize="54864,29635" o:gfxdata="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">
+              <v:group w14:anchorId="180A6110" id="Group 4" o:spid="_x0000_s1026" style="width:6in;height:233.35pt;mso-position-horizontal-relative:char;mso-position-vertical-relative:line" coordsize="54864,29635" o:gfxdata="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">
                 <v:shapetype id="_x0000_t75" coordsize="21600,21600" o:spt="75" o:preferrelative="t" path="m@4@5l@4@11@9@11@9@5xe" filled="f" stroked="f">
                   <v:stroke joinstyle="miter"/>
                   <v:formulas>
@@ -372,14 +271,14 @@
                   <v:path o:extrusionok="f" gradientshapeok="t" o:connecttype="rect"/>
                   <o:lock v:ext="edit" aspectratio="t"/>
                 </v:shapetype>
-                <v:shape id="Picture 1" o:spid="_x0000_s1027" type="#_x0000_t75" style="position:absolute;width:54864;height:29635;visibility:visible;mso-wrap-style:square" o:gfxdata="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">
+                <v:shape id="Picture 1" o:spid="_x0000_s1027" type="#_x0000_t75" style="position:absolute;width:54864;height:29635;visibility:visible;mso-wrap-style:square" o:gfxdata="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">
                   <v:imagedata r:id="rId9" o:title="" croptop="11361f"/>
                 </v:shape>
                 <v:shapetype id="_x0000_t202" coordsize="21600,21600" o:spt="202" path="m,l,21600r21600,l21600,xe">
                   <v:stroke joinstyle="miter"/>
                   <v:path gradientshapeok="t" o:connecttype="rect"/>
                 </v:shapetype>
-                <v:shape id="Text Box 4" o:spid="_x0000_s1028" type="#_x0000_t202" style="position:absolute;left:2214;top:785;width:36716;height:28850;visibility:visible;mso-wrap-style:square;v-text-anchor:top" o:gfxdata="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" filled="f" stroked="f" strokeweight=".5pt">
+                <v:shape id="Text Box 4" o:spid="_x0000_s1028" type="#_x0000_t202" style="position:absolute;left:2182;top:727;width:36715;height:28850;visibility:visible;mso-wrap-style:square;v-text-anchor:top" o:gfxdata="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" filled="f" stroked="f" strokeweight=".5pt">
                   <v:textbox>
                     <w:txbxContent>
                       <w:p>
@@ -402,23 +301,9 @@
                       </w:p>
                       <w:p>
                         <w:pPr>
-                          <w:tabs>
-                            <w:tab w:val="left" w:pos="2080"/>
-                          </w:tabs>
-                          <w:autoSpaceDE w:val="0"/>
-                          <w:autoSpaceDN w:val="0"/>
-                          <w:adjustRightInd w:val="0"/>
-                          <w:spacing w:after="60" w:line="240" w:lineRule="auto"/>
-                          <w:rPr>
-                            <w:rFonts w:ascii="Gill Sans Nova Medium" w:hAnsi="Gill Sans Nova Medium" w:cs="Gill Sans"/>
-                            <w:color w:val="000000"/>
-                          </w:rPr>
+                          <w:pStyle w:val="InsideCoverHeadingBlack"/>
                         </w:pPr>
                         <w:r>
-                          <w:rPr>
-                            <w:rFonts w:ascii="Gill Sans Nova Medium" w:hAnsi="Gill Sans Nova Medium" w:cs="Gill Sans"/>
-                            <w:color w:val="000000"/>
-                          </w:rPr>
                           <w:t xml:space="preserve">Easter Sunrise - 6:30 am at the Garden Chapel </w:t>
                         </w:r>
                       </w:p>
@@ -450,61 +335,7 @@
                             <w:sz w:val="20"/>
                             <w:szCs w:val="20"/>
                           </w:rPr>
-                          <w:t xml:space="preserve">With </w:t>
-                        </w:r>
-                        <w:r>
-                          <w:rPr>
-                            <w:rFonts w:ascii="Gill Sans Nova Light" w:hAnsi="Gill Sans Nova Light" w:cs="Gill Sans Nova Light"/>
-                            <w:color w:val="000000"/>
-                            <w:sz w:val="20"/>
-                            <w:szCs w:val="20"/>
-                          </w:rPr>
-                          <w:t xml:space="preserve">elements of the Easter vigil, including the new fire, </w:t>
-                        </w:r>
-                        <w:r>
-                          <w:rPr>
-                            <w:rFonts w:ascii="Gill Sans Nova Light" w:hAnsi="Gill Sans Nova Light" w:cs="Gill Sans Nova Light"/>
-                            <w:color w:val="000000"/>
-                            <w:sz w:val="20"/>
-                            <w:szCs w:val="20"/>
-                          </w:rPr>
-                          <w:t>a</w:t>
-                        </w:r>
-                        <w:r>
-                          <w:rPr>
-                            <w:rFonts w:ascii="Gill Sans Nova Light" w:hAnsi="Gill Sans Nova Light" w:cs="Gill Sans Nova Light"/>
-                            <w:color w:val="000000"/>
-                            <w:sz w:val="20"/>
-                            <w:szCs w:val="20"/>
-                          </w:rPr>
-                          <w:t xml:space="preserve">ccompanied by acoustic </w:t>
-                        </w:r>
-                        <w:r>
-                          <w:rPr>
-                            <w:rFonts w:ascii="Gill Sans Nova Light" w:hAnsi="Gill Sans Nova Light" w:cs="Gill Sans Nova Light"/>
-                            <w:color w:val="000000"/>
-                            <w:sz w:val="20"/>
-                            <w:szCs w:val="20"/>
-                          </w:rPr>
-                          <w:t xml:space="preserve">music, this beautiful </w:t>
-                        </w:r>
-                        <w:r>
-                          <w:rPr>
-                            <w:rFonts w:ascii="Gill Sans Nova Light" w:hAnsi="Gill Sans Nova Light" w:cs="Gill Sans Nova Light"/>
-                            <w:color w:val="000000"/>
-                            <w:sz w:val="20"/>
-                            <w:szCs w:val="20"/>
-                          </w:rPr>
-                          <w:t>liturgy</w:t>
-                        </w:r>
-                        <w:r>
-                          <w:rPr>
-                            <w:rFonts w:ascii="Gill Sans Nova Light" w:hAnsi="Gill Sans Nova Light" w:cs="Gill Sans Nova Light"/>
-                            <w:color w:val="000000"/>
-                            <w:sz w:val="20"/>
-                            <w:szCs w:val="20"/>
-                          </w:rPr>
-                          <w:t xml:space="preserve"> will begin while it is mostly dark and end in the full brightness of Easter morning. The Easter Sunrise service takes place at the outdoor Garden Chapel (on the front lawn). </w:t>
+                          <w:t xml:space="preserve">With elements of the Easter vigil, including the new fire, accompanied by acoustic music, this beautiful liturgy will begin while it is mostly dark and end in the full brightness of Easter morning. The Easter Sunrise service takes place at the outdoor Garden Chapel (on the front lawn). </w:t>
                         </w:r>
                         <w:r>
                           <w:rPr>
@@ -542,23 +373,9 @@
                       </w:p>
                       <w:p>
                         <w:pPr>
-                          <w:tabs>
-                            <w:tab w:val="left" w:pos="2080"/>
-                          </w:tabs>
-                          <w:autoSpaceDE w:val="0"/>
-                          <w:autoSpaceDN w:val="0"/>
-                          <w:adjustRightInd w:val="0"/>
-                          <w:spacing w:after="60" w:line="240" w:lineRule="auto"/>
-                          <w:rPr>
-                            <w:rFonts w:ascii="Gill Sans Nova Medium" w:hAnsi="Gill Sans Nova Medium" w:cs="Gill Sans"/>
-                            <w:color w:val="000000"/>
-                          </w:rPr>
+                          <w:pStyle w:val="InsideCoverHeadingBlack"/>
                         </w:pPr>
                         <w:r>
-                          <w:rPr>
-                            <w:rFonts w:ascii="Gill Sans Nova Medium" w:hAnsi="Gill Sans Nova Medium" w:cs="Gill Sans"/>
-                            <w:color w:val="000000"/>
-                          </w:rPr>
                           <w:t>The Great Easter Egg Hunt - 10 am (between services)</w:t>
                         </w:r>
                       </w:p>
@@ -593,24 +410,16 @@
                       </w:p>
                       <w:p>
                         <w:pPr>
-                          <w:tabs>
-                            <w:tab w:val="left" w:pos="2080"/>
-                          </w:tabs>
-                          <w:autoSpaceDE w:val="0"/>
-                          <w:autoSpaceDN w:val="0"/>
-                          <w:adjustRightInd w:val="0"/>
-                          <w:spacing w:after="60" w:line="240" w:lineRule="auto"/>
-                          <w:rPr>
-                            <w:rFonts w:ascii="Gill Sans Nova Medium" w:hAnsi="Gill Sans Nova Medium" w:cs="Gill Sans"/>
-                            <w:color w:val="000000"/>
-                          </w:rPr>
+                          <w:pStyle w:val="InsideCoverHeadingBlack"/>
                         </w:pPr>
                         <w:r>
-                          <w:rPr>
-                            <w:rFonts w:ascii="Gill Sans Nova Medium" w:hAnsi="Gill Sans Nova Medium" w:cs="Gill Sans"/>
-                            <w:color w:val="000000"/>
-                          </w:rPr>
-                          <w:t>Easter Day Services - 8 am, 9 am and 11 am</w:t>
+                          <w:t xml:space="preserve">Easter Day Services - 8 am, 9 am </w:t>
+                        </w:r>
+                        <w:r>
+                          <w:t>and</w:t>
+                        </w:r>
+                        <w:r>
+                          <w:t xml:space="preserve"> 11 am</w:t>
                         </w:r>
                       </w:p>
                       <w:p>
@@ -632,6 +441,7 @@
                     </w:txbxContent>
                   </v:textbox>
                 </v:shape>
+                <w10:anchorlock/>
               </v:group>
             </w:pict>
           </mc:Fallback>
@@ -3048,6 +2858,7 @@
   <w:style w:type="character" w:default="1" w:styleId="DefaultParagraphFont">
     <w:name w:val="Default Paragraph Font"/>
     <w:uiPriority w:val="1"/>
+    <w:semiHidden/>
     <w:unhideWhenUsed/>
   </w:style>
   <w:style w:type="table" w:default="1" w:styleId="TableNormal">
@@ -3070,28 +2881,6 @@
     <w:uiPriority w:val="99"/>
     <w:semiHidden/>
     <w:unhideWhenUsed/>
-  </w:style>
-  <w:style w:type="paragraph" w:styleId="Header">
-    <w:name w:val="header"/>
-    <w:basedOn w:val="Normal"/>
-    <w:link w:val="HeaderChar"/>
-    <w:uiPriority w:val="99"/>
-    <w:unhideWhenUsed/>
-    <w:rsid w:val="00E618BF"/>
-    <w:pPr>
-      <w:tabs>
-        <w:tab w:val="center" w:pos="4680"/>
-        <w:tab w:val="right" w:pos="9360"/>
-      </w:tabs>
-      <w:spacing w:after="0" w:line="240" w:lineRule="auto"/>
-    </w:pPr>
-  </w:style>
-  <w:style w:type="character" w:customStyle="1" w:styleId="HeaderChar">
-    <w:name w:val="Header Char"/>
-    <w:basedOn w:val="DefaultParagraphFont"/>
-    <w:link w:val="Header"/>
-    <w:uiPriority w:val="99"/>
-    <w:rsid w:val="00E618BF"/>
   </w:style>
   <w:style w:type="paragraph" w:styleId="Footer">
     <w:name w:val="footer"/>
@@ -13824,226 +13613,101 @@
       </w:tcPr>
     </w:tblStylePr>
   </w:style>
-  <w:style w:type="paragraph" w:customStyle="1" w:styleId="Heading">
-    <w:name w:val="Heading"/>
-    <w:pPr>
-      <w:keepNext/>
-      <w:spacing w:after="0" w:line="216" w:lineRule="auto"/>
-      <w:jc w:val="center"/>
+  <w:style w:type="paragraph" w:customStyle="1" w:styleId="InsideCoverHeading">
+    <w:name w:val="Inside Cover Heading"/>
+    <w:qFormat/>
+    <w:rsid w:val="00496C8B"/>
+    <w:pPr>
+      <w:spacing w:after="0" w:line="240" w:lineRule="auto"/>
+      <w:ind w:left="360" w:right="2678"/>
     </w:pPr>
     <w:rPr>
-      <w:rFonts w:ascii="Gill Sans Nova Book" w:hAnsi="Gill Sans Nova Book"/>
-      <w:b/>
+      <w:rFonts w:ascii="Gill Sans Nova Medium" w:hAnsi="Gill Sans Nova Medium"/>
+      <w:color w:val="FFFFFF" w:themeColor="background1"/>
+    </w:rPr>
+  </w:style>
+  <w:style w:type="paragraph" w:customStyle="1" w:styleId="InsideCoverHeadingBlack">
+    <w:name w:val="Inside Cover Heading Black"/>
+    <w:qFormat/>
+    <w:rsid w:val="00496C8B"/>
+    <w:pPr>
+      <w:tabs>
+        <w:tab w:val="left" w:pos="2080"/>
+      </w:tabs>
+      <w:autoSpaceDE w:val="0"/>
+      <w:autoSpaceDN w:val="0"/>
+      <w:adjustRightInd w:val="0"/>
+      <w:spacing w:after="60" w:line="240" w:lineRule="auto"/>
+    </w:pPr>
+    <w:rPr>
+      <w:rFonts w:ascii="Gill Sans Nova Medium" w:hAnsi="Gill Sans Nova Medium" w:cs="Gill Sans"/>
       <w:color w:val="000000"/>
-      <w:sz w:val="28"/>
     </w:rPr>
   </w:style>
-  <w:style w:type="paragraph" w:customStyle="1" w:styleId="Body">
-    <w:name w:val="Body"/>
-    <w:pPr>
-      <w:tabs>
-        <w:tab w:val="left" w:pos="2160"/>
-        <w:tab w:val="right" w:pos="8640"/>
-      </w:tabs>
-      <w:spacing w:after="0" w:line="240" w:lineRule="auto"/>
-      <w:ind w:left="461"/>
+  <w:style w:type="paragraph" w:customStyle="1" w:styleId="InsideCoverDayWhite">
+    <w:name w:val="Inside Cover Day White"/>
+    <w:qFormat/>
+    <w:rsid w:val="00496C8B"/>
+    <w:pPr>
+      <w:spacing w:after="60" w:line="240" w:lineRule="auto"/>
+      <w:ind w:right="2678"/>
     </w:pPr>
     <w:rPr>
       <w:rFonts w:ascii="Adobe Garamond Pro" w:hAnsi="Adobe Garamond Pro"/>
-      <w:color w:val="000000"/>
-      <w:sz w:val="24"/>
+      <w:color w:val="FFFFFF" w:themeColor="background1"/>
+      <w:sz w:val="48"/>
+      <w:szCs w:val="48"/>
     </w:rPr>
   </w:style>
-  <w:style w:type="paragraph" w:customStyle="1" w:styleId="Body-Celebrant">
-    <w:name w:val="Body - Celebrant"/>
-    <w:pPr>
-      <w:spacing w:before="60" w:after="0" w:line="240" w:lineRule="auto"/>
-      <w:ind w:left="1498" w:hanging="1037"/>
+  <w:style w:type="paragraph" w:customStyle="1" w:styleId="InsideCoverDayBlack">
+    <w:name w:val="Inside Cover Day Black"/>
+    <w:qFormat/>
+    <w:rsid w:val="00496C8B"/>
+    <w:pPr>
+      <w:spacing w:after="60" w:line="240" w:lineRule="auto"/>
     </w:pPr>
     <w:rPr>
       <w:rFonts w:ascii="Adobe Garamond Pro" w:hAnsi="Adobe Garamond Pro"/>
-      <w:color w:val="000000"/>
-      <w:sz w:val="24"/>
+      <w:sz w:val="48"/>
+      <w:szCs w:val="48"/>
     </w:rPr>
   </w:style>
-  <w:style w:type="paragraph" w:customStyle="1" w:styleId="Body-People">
-    <w:name w:val="Body - People"/>
-    <w:pPr>
-      <w:spacing w:before="20" w:after="0" w:line="240" w:lineRule="auto"/>
-      <w:ind w:left="1498" w:hanging="1037"/>
+  <w:style w:type="paragraph" w:customStyle="1" w:styleId="InsideCoverDescriptionBlack">
+    <w:name w:val="Inside Cover Description Black"/>
+    <w:qFormat/>
+    <w:rsid w:val="00496C8B"/>
+    <w:pPr>
+      <w:tabs>
+        <w:tab w:val="left" w:pos="2080"/>
+        <w:tab w:val="right" w:pos="8470"/>
+      </w:tabs>
+      <w:autoSpaceDE w:val="0"/>
+      <w:autoSpaceDN w:val="0"/>
+      <w:adjustRightInd w:val="0"/>
+      <w:spacing w:line="216" w:lineRule="auto"/>
+      <w:ind w:right="10"/>
+      <w:jc w:val="both"/>
     </w:pPr>
     <w:rPr>
-      <w:rFonts w:ascii="Adobe Garamond Pro" w:hAnsi="Adobe Garamond Pro"/>
-      <w:b/>
-      <w:color w:val="000000"/>
-      <w:sz w:val="24"/>
-    </w:rPr>
-  </w:style>
-  <w:style w:type="paragraph" w:customStyle="1" w:styleId="Body-Rubric">
-    <w:name w:val="Body - Rubric"/>
-    <w:pPr>
-      <w:spacing w:before="40" w:after="0" w:line="240" w:lineRule="auto"/>
-      <w:ind w:left="461"/>
-    </w:pPr>
-    <w:rPr>
-      <w:rFonts w:ascii="Adobe Garamond Pro" w:hAnsi="Adobe Garamond Pro"/>
-      <w:i/>
+      <w:rFonts w:ascii="Gill Sans Nova Light" w:hAnsi="Gill Sans Nova Light" w:cs="Gill Sans Nova Light"/>
       <w:color w:val="000000"/>
       <w:sz w:val="20"/>
+      <w:szCs w:val="20"/>
     </w:rPr>
   </w:style>
-  <w:style w:type="paragraph" w:customStyle="1" w:styleId="Body-IntroductoryRubric">
-    <w:name w:val="Body - Introductory Rubric"/>
+  <w:style w:type="paragraph" w:customStyle="1" w:styleId="InsideCoverDescription">
+    <w:name w:val="Inside Cover Description"/>
+    <w:qFormat/>
+    <w:rsid w:val="00496C8B"/>
     <w:pPr>
       <w:spacing w:after="0" w:line="240" w:lineRule="auto"/>
-      <w:ind w:left="6"/>
-    </w:pPr>
-    <w:rPr>
-      <w:rFonts w:ascii="Adobe Garamond Pro" w:hAnsi="Adobe Garamond Pro"/>
-      <w:i/>
-      <w:color w:val="000000"/>
-      <w:sz w:val="20"/>
-    </w:rPr>
-  </w:style>
-  <w:style w:type="paragraph" w:customStyle="1" w:styleId="Body-Lyrics">
-    <w:name w:val="Body - Lyrics"/>
-    <w:pPr>
-      <w:spacing w:after="0" w:line="240" w:lineRule="auto"/>
-      <w:ind w:left="720" w:hanging="259"/>
-    </w:pPr>
-    <w:rPr>
-      <w:rFonts w:ascii="Gill Sans Light" w:hAnsi="Gill Sans Light"/>
-      <w:color w:val="000000"/>
-      <w:sz w:val="24"/>
-    </w:rPr>
-  </w:style>
-  <w:style w:type="paragraph" w:customStyle="1" w:styleId="ReadingGospelText">
-    <w:name w:val="Reading/Gospel Text"/>
-    <w:pPr>
-      <w:spacing w:after="0" w:line="240" w:lineRule="auto"/>
-      <w:ind w:left="461"/>
-    </w:pPr>
-    <w:rPr>
-      <w:rFonts w:ascii="Adobe Garamond Pro" w:hAnsi="Adobe Garamond Pro"/>
-      <w:color w:val="000000"/>
-    </w:rPr>
-  </w:style>
-  <w:style w:type="paragraph" w:customStyle="1" w:styleId="ReadingPoetry">
-    <w:name w:val="Reading (Poetry)"/>
-    <w:pPr>
-      <w:spacing w:after="0" w:line="240" w:lineRule="auto"/>
-      <w:ind w:left="655" w:hanging="194"/>
-    </w:pPr>
-    <w:rPr>
-      <w:rFonts w:ascii="Adobe Garamond Pro" w:hAnsi="Adobe Garamond Pro"/>
-      <w:color w:val="000000"/>
-    </w:rPr>
-  </w:style>
-  <w:style w:type="paragraph" w:customStyle="1" w:styleId="Psalm">
-    <w:name w:val="Psalm"/>
-    <w:pPr>
-      <w:spacing w:before="60" w:after="0" w:line="240" w:lineRule="auto"/>
-      <w:ind w:left="655" w:hanging="187"/>
-    </w:pPr>
-    <w:rPr>
-      <w:rFonts w:ascii="Adobe Garamond Pro" w:hAnsi="Adobe Garamond Pro"/>
-      <w:color w:val="000000"/>
-      <w:sz w:val="24"/>
-    </w:rPr>
-  </w:style>
-  <w:style w:type="paragraph" w:customStyle="1" w:styleId="Body-PeopleRecitation">
-    <w:name w:val="Body - People Recitation"/>
-    <w:pPr>
-      <w:spacing w:before="120" w:after="0" w:line="240" w:lineRule="auto"/>
-      <w:ind w:left="461"/>
-    </w:pPr>
-    <w:rPr>
-      <w:rFonts w:ascii="Adobe Garamond Pro" w:hAnsi="Adobe Garamond Pro"/>
-      <w:color w:val="000000"/>
-      <w:sz w:val="24"/>
-    </w:rPr>
-  </w:style>
-  <w:style w:type="paragraph" w:customStyle="1" w:styleId="Body-PeopleRecitationCreed">
-    <w:name w:val="Body - People Recitation (Creed)"/>
-    <w:pPr>
-      <w:spacing w:before="120" w:after="0" w:line="240" w:lineRule="auto"/>
-      <w:ind w:left="655" w:hanging="259"/>
-    </w:pPr>
-    <w:rPr>
-      <w:rFonts w:ascii="Adobe Garamond Pro" w:hAnsi="Adobe Garamond Pro"/>
-      <w:color w:val="000000"/>
-      <w:sz w:val="24"/>
-    </w:rPr>
-  </w:style>
-  <w:style w:type="paragraph" w:customStyle="1" w:styleId="CoverNote">
-    <w:name w:val="Cover Note"/>
-    <w:pPr>
-      <w:spacing w:after="0" w:line="240" w:lineRule="auto"/>
-      <w:jc w:val="both"/>
-    </w:pPr>
-    <w:rPr>
-      <w:rFonts w:ascii="Adobe Garamond Pro" w:hAnsi="Adobe Garamond Pro"/>
-      <w:color w:val="000000"/>
-    </w:rPr>
-  </w:style>
-  <w:style w:type="paragraph" w:customStyle="1" w:styleId="Spacer-Small">
-    <w:name w:val="Spacer - Small"/>
-    <w:pPr>
-      <w:spacing w:after="0" w:line="240" w:lineRule="auto"/>
-    </w:pPr>
-    <w:rPr>
-      <w:rFonts w:ascii="Adobe Garamond Pro" w:hAnsi="Adobe Garamond Pro"/>
-      <w:color w:val="000000"/>
-      <w:sz w:val="20"/>
-    </w:rPr>
-  </w:style>
-  <w:style w:type="paragraph" w:customStyle="1" w:styleId="Staff-Name">
-    <w:name w:val="Staff - Name"/>
-    <w:pPr>
-      <w:spacing w:before="100" w:after="0" w:line="240" w:lineRule="auto"/>
-      <w:jc w:val="center"/>
-    </w:pPr>
-    <w:rPr>
-      <w:rFonts w:ascii="Adobe Garamond Pro Bold" w:hAnsi="Adobe Garamond Pro Bold"/>
-      <w:b/>
-      <w:color w:val="000000"/>
-      <w:sz w:val="18"/>
-    </w:rPr>
-  </w:style>
-  <w:style w:type="paragraph" w:customStyle="1" w:styleId="Staff-Title">
-    <w:name w:val="Staff - Title"/>
-    <w:pPr>
-      <w:spacing w:after="0" w:line="240" w:lineRule="auto"/>
-      <w:jc w:val="center"/>
-    </w:pPr>
-    <w:rPr>
-      <w:rFonts w:ascii="Adobe Garamond Pro" w:hAnsi="Adobe Garamond Pro"/>
-      <w:i/>
-      <w:color w:val="000000"/>
-      <w:sz w:val="18"/>
-    </w:rPr>
-  </w:style>
-  <w:style w:type="paragraph" w:customStyle="1" w:styleId="Staff-Email">
-    <w:name w:val="Staff - Email"/>
-    <w:pPr>
-      <w:spacing w:after="0" w:line="240" w:lineRule="auto"/>
-      <w:jc w:val="center"/>
-    </w:pPr>
-    <w:rPr>
-      <w:rFonts w:ascii="Adobe Garamond Pro" w:hAnsi="Adobe Garamond Pro"/>
-      <w:color w:val="000000"/>
-      <w:sz w:val="18"/>
-    </w:rPr>
-  </w:style>
-  <w:style w:type="paragraph" w:customStyle="1" w:styleId="HeaderFooter">
-    <w:name w:val="Header &amp; Footer"/>
-    <w:pPr>
-      <w:spacing w:after="0" w:line="240" w:lineRule="auto"/>
+      <w:ind w:left="360" w:right="2678"/>
     </w:pPr>
     <w:rPr>
       <w:rFonts w:ascii="Gill Sans Nova Light" w:hAnsi="Gill Sans Nova Light"/>
-      <w:color w:val="000000"/>
+      <w:color w:val="FFFFFF" w:themeColor="background1"/>
       <w:sz w:val="18"/>
+      <w:szCs w:val="18"/>
     </w:rPr>
   </w:style>
   <w:style w:type="numbering" w:customStyle="1" w:styleId="CurrentList1">
@@ -14075,419 +13739,6 @@
         <w:numId w:val="21"/>
       </w:numPr>
     </w:pPr>
-  </w:style>
-  <w:style w:type="paragraph" w:customStyle="1" w:styleId="CoreValues">
-    <w:name w:val="Core Values"/>
-    <w:qFormat/>
-    <w:rsid w:val="00E508AE"/>
-    <w:pPr>
-      <w:tabs>
-        <w:tab w:val="center" w:pos="3240"/>
-        <w:tab w:val="center" w:pos="6120"/>
-        <w:tab w:val="right" w:pos="9000"/>
-      </w:tabs>
-    </w:pPr>
-    <w:rPr>
-      <w:rFonts w:ascii="Gill Sans Nova SemiBold" w:hAnsi="Gill Sans Nova SemiBold"/>
-      <w:b/>
-      <w:bCs/>
-      <w:color w:val="000000"/>
-      <w:sz w:val="24"/>
-      <w14:textFill>
-        <w14:solidFill>
-          <w14:srgbClr w14:val="000000">
-            <w14:alpha w14:val="80308"/>
-          </w14:srgbClr>
-        </w14:solidFill>
-      </w14:textFill>
-    </w:rPr>
-  </w:style>
-  <w:style w:type="paragraph" w:customStyle="1" w:styleId="Body-Dialogue">
-    <w:name w:val="Body - Dialogue"/>
-    <w:pPr>
-      <w:tabs>
-        <w:tab w:val="left" w:pos="2160"/>
-        <w:tab w:val="right" w:pos="8640"/>
-      </w:tabs>
-      <w:spacing w:after="0" w:line="240" w:lineRule="auto"/>
-      <w:ind w:left="2160" w:hanging="1699"/>
-    </w:pPr>
-    <w:rPr>
-      <w:rFonts w:ascii="Adobe Garamond Pro" w:hAnsi="Adobe Garamond Pro"/>
-      <w:color w:val="000000"/>
-      <w:sz w:val="24"/>
-    </w:rPr>
-  </w:style>
-  <w:style w:type="paragraph" w:customStyle="1" w:styleId="Body-LyricsRight">
-    <w:name w:val="Body - Lyrics Right"/>
-    <w:pPr>
-      <w:spacing w:after="0" w:line="240" w:lineRule="auto"/>
-      <w:ind w:left="720" w:hanging="547"/>
-    </w:pPr>
-    <w:rPr>
-      <w:rFonts w:ascii="Gill Sans Light" w:hAnsi="Gill Sans Light"/>
-      <w:color w:val="000000"/>
-      <w:sz w:val="24"/>
-    </w:rPr>
-  </w:style>
-  <w:style w:type="paragraph" w:customStyle="1" w:styleId="PassionGospel-Narrator">
-    <w:name w:val="Passion Gospel - Narrator"/>
-    <w:pPr>
-      <w:tabs>
-        <w:tab w:val="left" w:pos="1699"/>
-      </w:tabs>
-      <w:spacing w:after="0" w:line="240" w:lineRule="auto"/>
-      <w:ind w:left="1699" w:hanging="1238"/>
-    </w:pPr>
-    <w:rPr>
-      <w:rFonts w:ascii="Adobe Garamond Pro" w:hAnsi="Adobe Garamond Pro"/>
-      <w:color w:val="000000"/>
-    </w:rPr>
-  </w:style>
-  <w:style w:type="paragraph" w:customStyle="1" w:styleId="PassionGospel-Jesus">
-    <w:name w:val="Passion Gospel - Jesus"/>
-    <w:pPr>
-      <w:tabs>
-        <w:tab w:val="left" w:pos="1699"/>
-      </w:tabs>
-      <w:spacing w:after="0" w:line="240" w:lineRule="auto"/>
-      <w:ind w:left="1699" w:hanging="1238"/>
-    </w:pPr>
-    <w:rPr>
-      <w:rFonts w:ascii="Adobe Garamond Pro" w:hAnsi="Adobe Garamond Pro"/>
-      <w:color w:val="000000"/>
-    </w:rPr>
-  </w:style>
-  <w:style w:type="paragraph" w:customStyle="1" w:styleId="PassionGospel-Pilate">
-    <w:name w:val="Passion Gospel - Pilate"/>
-    <w:pPr>
-      <w:tabs>
-        <w:tab w:val="left" w:pos="1699"/>
-      </w:tabs>
-      <w:spacing w:after="0" w:line="240" w:lineRule="auto"/>
-      <w:ind w:left="1699" w:hanging="1238"/>
-    </w:pPr>
-    <w:rPr>
-      <w:rFonts w:ascii="Adobe Garamond Pro" w:hAnsi="Adobe Garamond Pro"/>
-      <w:color w:val="000000"/>
-    </w:rPr>
-  </w:style>
-  <w:style w:type="paragraph" w:customStyle="1" w:styleId="PassionGospel-Wife">
-    <w:name w:val="Passion Gospel - Wife"/>
-    <w:pPr>
-      <w:tabs>
-        <w:tab w:val="left" w:pos="1699"/>
-      </w:tabs>
-      <w:spacing w:after="0" w:line="240" w:lineRule="auto"/>
-      <w:ind w:left="1699" w:hanging="1238"/>
-    </w:pPr>
-    <w:rPr>
-      <w:rFonts w:ascii="Adobe Garamond Pro" w:hAnsi="Adobe Garamond Pro"/>
-      <w:color w:val="000000"/>
-    </w:rPr>
-  </w:style>
-  <w:style w:type="paragraph" w:customStyle="1" w:styleId="PassionGospel-Soldier">
-    <w:name w:val="Passion Gospel - Soldier"/>
-    <w:pPr>
-      <w:tabs>
-        <w:tab w:val="left" w:pos="1699"/>
-      </w:tabs>
-      <w:spacing w:after="0" w:line="240" w:lineRule="auto"/>
-      <w:ind w:left="1699" w:hanging="1238"/>
-    </w:pPr>
-    <w:rPr>
-      <w:rFonts w:ascii="Adobe Garamond Pro" w:hAnsi="Adobe Garamond Pro"/>
-      <w:color w:val="000000"/>
-    </w:rPr>
-  </w:style>
-  <w:style w:type="paragraph" w:customStyle="1" w:styleId="PassionGospel-Servant1">
-    <w:name w:val="Passion Gospel - Servant 1"/>
-    <w:pPr>
-      <w:tabs>
-        <w:tab w:val="left" w:pos="1699"/>
-      </w:tabs>
-      <w:spacing w:after="0" w:line="240" w:lineRule="auto"/>
-      <w:ind w:left="1699" w:hanging="1238"/>
-    </w:pPr>
-    <w:rPr>
-      <w:rFonts w:ascii="Adobe Garamond Pro" w:hAnsi="Adobe Garamond Pro"/>
-      <w:color w:val="000000"/>
-    </w:rPr>
-  </w:style>
-  <w:style w:type="paragraph" w:customStyle="1" w:styleId="PassionGospel-Servant2">
-    <w:name w:val="Passion Gospel - Servant 2"/>
-    <w:pPr>
-      <w:tabs>
-        <w:tab w:val="left" w:pos="1699"/>
-      </w:tabs>
-      <w:spacing w:after="0" w:line="240" w:lineRule="auto"/>
-      <w:ind w:left="1699" w:hanging="1238"/>
-    </w:pPr>
-    <w:rPr>
-      <w:rFonts w:ascii="Adobe Garamond Pro" w:hAnsi="Adobe Garamond Pro"/>
-      <w:color w:val="000000"/>
-    </w:rPr>
-  </w:style>
-  <w:style w:type="paragraph" w:customStyle="1" w:styleId="PassionGospel-Passerby1">
-    <w:name w:val="Passion Gospel - Passerby 1"/>
-    <w:pPr>
-      <w:tabs>
-        <w:tab w:val="left" w:pos="1699"/>
-      </w:tabs>
-      <w:spacing w:after="0" w:line="240" w:lineRule="auto"/>
-      <w:ind w:left="1699" w:hanging="1238"/>
-    </w:pPr>
-    <w:rPr>
-      <w:rFonts w:ascii="Adobe Garamond Pro" w:hAnsi="Adobe Garamond Pro"/>
-      <w:color w:val="000000"/>
-    </w:rPr>
-  </w:style>
-  <w:style w:type="paragraph" w:customStyle="1" w:styleId="PassionGospel-Passerby2">
-    <w:name w:val="Passion Gospel - Passerby 2"/>
-    <w:pPr>
-      <w:tabs>
-        <w:tab w:val="left" w:pos="1699"/>
-      </w:tabs>
-      <w:spacing w:after="0" w:line="240" w:lineRule="auto"/>
-      <w:ind w:left="1699" w:hanging="1238"/>
-    </w:pPr>
-    <w:rPr>
-      <w:rFonts w:ascii="Adobe Garamond Pro" w:hAnsi="Adobe Garamond Pro"/>
-      <w:color w:val="000000"/>
-    </w:rPr>
-  </w:style>
-  <w:style w:type="paragraph" w:customStyle="1" w:styleId="PassionGospel-ChiefPriest">
-    <w:name w:val="Passion Gospel - Chief Priest"/>
-    <w:pPr>
-      <w:tabs>
-        <w:tab w:val="left" w:pos="1699"/>
-      </w:tabs>
-      <w:spacing w:after="0" w:line="240" w:lineRule="auto"/>
-      <w:ind w:left="1699" w:hanging="1238"/>
-    </w:pPr>
-    <w:rPr>
-      <w:rFonts w:ascii="Adobe Garamond Pro" w:hAnsi="Adobe Garamond Pro"/>
-      <w:color w:val="000000"/>
-    </w:rPr>
-  </w:style>
-  <w:style w:type="paragraph" w:customStyle="1" w:styleId="PassionGospel-Scribe">
-    <w:name w:val="Passion Gospel - Scribe"/>
-    <w:pPr>
-      <w:tabs>
-        <w:tab w:val="left" w:pos="1699"/>
-      </w:tabs>
-      <w:spacing w:after="0" w:line="240" w:lineRule="auto"/>
-      <w:ind w:left="1699" w:hanging="1238"/>
-    </w:pPr>
-    <w:rPr>
-      <w:rFonts w:ascii="Adobe Garamond Pro" w:hAnsi="Adobe Garamond Pro"/>
-      <w:color w:val="000000"/>
-    </w:rPr>
-  </w:style>
-  <w:style w:type="paragraph" w:customStyle="1" w:styleId="PassionGospel-Elder">
-    <w:name w:val="Passion Gospel - Elder"/>
-    <w:pPr>
-      <w:tabs>
-        <w:tab w:val="left" w:pos="1699"/>
-      </w:tabs>
-      <w:spacing w:after="0" w:line="240" w:lineRule="auto"/>
-      <w:ind w:left="1699" w:hanging="1238"/>
-    </w:pPr>
-    <w:rPr>
-      <w:rFonts w:ascii="Adobe Garamond Pro" w:hAnsi="Adobe Garamond Pro"/>
-      <w:color w:val="000000"/>
-    </w:rPr>
-  </w:style>
-  <w:style w:type="paragraph" w:customStyle="1" w:styleId="PassionGospel-Bystander1">
-    <w:name w:val="Passion Gospel - Bystander 1"/>
-    <w:pPr>
-      <w:tabs>
-        <w:tab w:val="left" w:pos="1699"/>
-      </w:tabs>
-      <w:spacing w:after="0" w:line="240" w:lineRule="auto"/>
-      <w:ind w:left="1699" w:hanging="1238"/>
-    </w:pPr>
-    <w:rPr>
-      <w:rFonts w:ascii="Adobe Garamond Pro" w:hAnsi="Adobe Garamond Pro"/>
-      <w:color w:val="000000"/>
-    </w:rPr>
-  </w:style>
-  <w:style w:type="paragraph" w:customStyle="1" w:styleId="PassionGospel-Bystander2">
-    <w:name w:val="Passion Gospel - Bystander 2"/>
-    <w:pPr>
-      <w:tabs>
-        <w:tab w:val="left" w:pos="1699"/>
-      </w:tabs>
-      <w:spacing w:after="0" w:line="240" w:lineRule="auto"/>
-      <w:ind w:left="1699" w:hanging="1238"/>
-    </w:pPr>
-    <w:rPr>
-      <w:rFonts w:ascii="Adobe Garamond Pro" w:hAnsi="Adobe Garamond Pro"/>
-      <w:color w:val="000000"/>
-    </w:rPr>
-  </w:style>
-  <w:style w:type="paragraph" w:customStyle="1" w:styleId="PassionGospel-Centurion">
-    <w:name w:val="Passion Gospel - Centurion"/>
-    <w:pPr>
-      <w:tabs>
-        <w:tab w:val="left" w:pos="1699"/>
-      </w:tabs>
-      <w:spacing w:after="0" w:line="240" w:lineRule="auto"/>
-      <w:ind w:left="1699" w:hanging="1238"/>
-    </w:pPr>
-    <w:rPr>
-      <w:rFonts w:ascii="Adobe Garamond Pro" w:hAnsi="Adobe Garamond Pro"/>
-      <w:color w:val="000000"/>
-    </w:rPr>
-  </w:style>
-  <w:style w:type="paragraph" w:customStyle="1" w:styleId="PassionGospel-Peter">
-    <w:name w:val="Passion Gospel - Peter"/>
-    <w:pPr>
-      <w:tabs>
-        <w:tab w:val="left" w:pos="1699"/>
-      </w:tabs>
-      <w:spacing w:after="0" w:line="240" w:lineRule="auto"/>
-      <w:ind w:left="1699" w:hanging="1238"/>
-    </w:pPr>
-    <w:rPr>
-      <w:rFonts w:ascii="Adobe Garamond Pro" w:hAnsi="Adobe Garamond Pro"/>
-      <w:color w:val="000000"/>
-    </w:rPr>
-  </w:style>
-  <w:style w:type="paragraph" w:customStyle="1" w:styleId="PassionGospel-Guard">
-    <w:name w:val="Passion Gospel - Guard"/>
-    <w:pPr>
-      <w:tabs>
-        <w:tab w:val="left" w:pos="1699"/>
-      </w:tabs>
-      <w:spacing w:after="0" w:line="240" w:lineRule="auto"/>
-      <w:ind w:left="1699" w:hanging="1238"/>
-    </w:pPr>
-    <w:rPr>
-      <w:rFonts w:ascii="Adobe Garamond Pro" w:hAnsi="Adobe Garamond Pro"/>
-      <w:color w:val="000000"/>
-    </w:rPr>
-  </w:style>
-  <w:style w:type="paragraph" w:customStyle="1" w:styleId="PassionGospel-Police">
-    <w:name w:val="Passion Gospel - Police"/>
-    <w:pPr>
-      <w:tabs>
-        <w:tab w:val="left" w:pos="1699"/>
-      </w:tabs>
-      <w:spacing w:after="0" w:line="240" w:lineRule="auto"/>
-      <w:ind w:left="1699" w:hanging="1238"/>
-    </w:pPr>
-    <w:rPr>
-      <w:rFonts w:ascii="Adobe Garamond Pro" w:hAnsi="Adobe Garamond Pro"/>
-      <w:color w:val="000000"/>
-    </w:rPr>
-  </w:style>
-  <w:style w:type="paragraph" w:customStyle="1" w:styleId="PassionGospel-Priest">
-    <w:name w:val="Passion Gospel - Priest"/>
-    <w:pPr>
-      <w:tabs>
-        <w:tab w:val="left" w:pos="1699"/>
-      </w:tabs>
-      <w:spacing w:after="0" w:line="240" w:lineRule="auto"/>
-      <w:ind w:left="1699" w:hanging="1238"/>
-    </w:pPr>
-    <w:rPr>
-      <w:rFonts w:ascii="Adobe Garamond Pro" w:hAnsi="Adobe Garamond Pro"/>
-      <w:color w:val="000000"/>
-    </w:rPr>
-  </w:style>
-  <w:style w:type="paragraph" w:customStyle="1" w:styleId="PassionGospel-Slave">
-    <w:name w:val="Passion Gospel - Slave"/>
-    <w:pPr>
-      <w:tabs>
-        <w:tab w:val="left" w:pos="1699"/>
-        <w:tab w:val="left" w:pos="1699"/>
-      </w:tabs>
-      <w:spacing w:after="0" w:line="240" w:lineRule="auto"/>
-      <w:ind w:left="1699" w:hanging="1238"/>
-    </w:pPr>
-    <w:rPr>
-      <w:rFonts w:ascii="Adobe Garamond Pro" w:hAnsi="Adobe Garamond Pro"/>
-      <w:color w:val="000000"/>
-    </w:rPr>
-  </w:style>
-  <w:style w:type="paragraph" w:customStyle="1" w:styleId="PassionGospel-Disciples">
-    <w:name w:val="Passion Gospel - Disciples"/>
-    <w:pPr>
-      <w:tabs>
-        <w:tab w:val="left" w:pos="1699"/>
-      </w:tabs>
-      <w:spacing w:after="0" w:line="240" w:lineRule="auto"/>
-      <w:ind w:left="1699" w:hanging="1238"/>
-    </w:pPr>
-    <w:rPr>
-      <w:rFonts w:ascii="Adobe Garamond Pro" w:hAnsi="Adobe Garamond Pro"/>
-      <w:color w:val="000000"/>
-    </w:rPr>
-  </w:style>
-  <w:style w:type="paragraph" w:customStyle="1" w:styleId="PassionGospel-Maid">
-    <w:name w:val="Passion Gospel - Maid"/>
-    <w:pPr>
-      <w:tabs>
-        <w:tab w:val="left" w:pos="1699"/>
-      </w:tabs>
-      <w:spacing w:after="0" w:line="240" w:lineRule="auto"/>
-      <w:ind w:left="1699" w:hanging="1238"/>
-    </w:pPr>
-    <w:rPr>
-      <w:rFonts w:ascii="Adobe Garamond Pro" w:hAnsi="Adobe Garamond Pro"/>
-      <w:color w:val="000000"/>
-    </w:rPr>
-  </w:style>
-  <w:style w:type="paragraph" w:customStyle="1" w:styleId="PassionGospel-Officer">
-    <w:name w:val="Passion Gospel - Officer"/>
-    <w:pPr>
-      <w:tabs>
-        <w:tab w:val="left" w:pos="1699"/>
-      </w:tabs>
-      <w:spacing w:after="0" w:line="240" w:lineRule="auto"/>
-      <w:ind w:left="1699" w:hanging="1238"/>
-    </w:pPr>
-    <w:rPr>
-      <w:rFonts w:ascii="Adobe Garamond Pro" w:hAnsi="Adobe Garamond Pro"/>
-      <w:color w:val="000000"/>
-    </w:rPr>
-  </w:style>
-  <w:style w:type="paragraph" w:customStyle="1" w:styleId="PassionGospel-Elder1">
-    <w:name w:val="Passion Gospel - Elder 1"/>
-    <w:pPr>
-      <w:tabs>
-        <w:tab w:val="left" w:pos="1699"/>
-      </w:tabs>
-      <w:spacing w:after="0" w:line="240" w:lineRule="auto"/>
-      <w:ind w:left="1699" w:hanging="1238"/>
-    </w:pPr>
-    <w:rPr>
-      <w:rFonts w:ascii="Adobe Garamond Pro" w:hAnsi="Adobe Garamond Pro"/>
-      <w:color w:val="000000"/>
-    </w:rPr>
-  </w:style>
-  <w:style w:type="paragraph" w:customStyle="1" w:styleId="PassionGospel-Elder2">
-    <w:name w:val="Passion Gospel - Elder 2"/>
-    <w:pPr>
-      <w:tabs>
-        <w:tab w:val="left" w:pos="1699"/>
-      </w:tabs>
-      <w:spacing w:after="0" w:line="240" w:lineRule="auto"/>
-      <w:ind w:left="1699" w:hanging="1238"/>
-    </w:pPr>
-    <w:rPr>
-      <w:rFonts w:ascii="Adobe Garamond Pro" w:hAnsi="Adobe Garamond Pro"/>
-      <w:color w:val="000000"/>
-    </w:rPr>
-  </w:style>
-  <w:style w:type="character" w:customStyle="1" w:styleId="People">
-    <w:name w:val="People"/>
-    <w:rPr>
-      <w:rFonts w:ascii="Adobe Garamond Pro Bold" w:hAnsi="Adobe Garamond Pro Bold"/>
-      <w:b/>
-      <w:color w:val="000000"/>
-    </w:rPr>
   </w:style>
 </w:styles>
 </file>

</xml_diff>